<commit_message>
Update document with new changes
</commit_message>
<xml_diff>
--- a/Project_Documentation.docx
+++ b/Project_Documentation.docx
@@ -179,7 +179,25 @@
           <w:szCs w:val="24"/>
           <w:lang w:val="en-IN"/>
         </w:rPr>
-        <w:t>The objective of this project is to develop a Python-based system that analyzes student academic performance using NumPy and Pandas. The system processes student records, calculates marks and averages, and generates meaningful performance summaries.</w:t>
+        <w:t xml:space="preserve">The objective of this project is to develop a Python-based system that </w:t>
+      </w:r>
+      <w:proofErr w:type="spellStart"/>
+      <w:r>
+        <w:rPr>
+          <w:sz w:val="24"/>
+          <w:szCs w:val="24"/>
+          <w:lang w:val="en-IN"/>
+        </w:rPr>
+        <w:t>analyzes</w:t>
+      </w:r>
+      <w:proofErr w:type="spellEnd"/>
+      <w:r>
+        <w:rPr>
+          <w:sz w:val="24"/>
+          <w:szCs w:val="24"/>
+          <w:lang w:val="en-IN"/>
+        </w:rPr>
+        <w:t xml:space="preserve"> student academic performance using NumPy and Pandas. The system processes student records, calculates marks and averages, and generates meaningful performance summaries.</w:t>
       </w:r>
     </w:p>
     <w:p>
@@ -317,7 +335,25 @@
           <w:szCs w:val="24"/>
           <w:lang w:val="en-IN"/>
         </w:rPr>
-        <w:t xml:space="preserve"> Used for loading, organizing, processing, filtering, and analyzing student data.</w:t>
+        <w:t xml:space="preserve"> Used for loading, organizing, processing, filtering, and </w:t>
+      </w:r>
+      <w:proofErr w:type="spellStart"/>
+      <w:r>
+        <w:rPr>
+          <w:sz w:val="24"/>
+          <w:szCs w:val="24"/>
+          <w:lang w:val="en-IN"/>
+        </w:rPr>
+        <w:t>analyzing</w:t>
+      </w:r>
+      <w:proofErr w:type="spellEnd"/>
+      <w:r>
+        <w:rPr>
+          <w:sz w:val="24"/>
+          <w:szCs w:val="24"/>
+          <w:lang w:val="en-IN"/>
+        </w:rPr>
+        <w:t xml:space="preserve"> student data.</w:t>
       </w:r>
     </w:p>
     <w:p>
@@ -398,10 +434,7 @@
         <w:pStyle w:val="Heading1"/>
       </w:pPr>
       <w:r>
-        <w:t>D</w:t>
-      </w:r>
-      <w:r>
-        <w:t>ataset Description</w:t>
+        <w:t>Dataset Description</w:t>
       </w:r>
     </w:p>
     <w:p>
@@ -418,7 +451,25 @@
           <w:szCs w:val="24"/>
           <w:lang w:val="en-IN"/>
         </w:rPr>
-        <w:t>The project uses a CSV dataset containing student information, academic marks, department details, and attendance percentages. The dataset is loaded into a Pandas DataFrame for further processing.</w:t>
+        <w:t xml:space="preserve">The project uses a CSV dataset containing student information, academic marks, department details, and attendance percentages. The dataset is loaded into a Pandas </w:t>
+      </w:r>
+      <w:proofErr w:type="spellStart"/>
+      <w:r>
+        <w:rPr>
+          <w:sz w:val="24"/>
+          <w:szCs w:val="24"/>
+          <w:lang w:val="en-IN"/>
+        </w:rPr>
+        <w:t>DataFrame</w:t>
+      </w:r>
+      <w:proofErr w:type="spellEnd"/>
+      <w:r>
+        <w:rPr>
+          <w:sz w:val="24"/>
+          <w:szCs w:val="24"/>
+          <w:lang w:val="en-IN"/>
+        </w:rPr>
+        <w:t xml:space="preserve"> for further processing.</w:t>
       </w:r>
     </w:p>
     <w:p>
@@ -540,13 +591,23 @@
           <w:lang w:val="en-IN"/>
         </w:rPr>
       </w:pPr>
+      <w:proofErr w:type="spellStart"/>
       <w:r>
         <w:rPr>
           <w:sz w:val="24"/>
           <w:szCs w:val="24"/>
           <w:lang w:val="en-IN"/>
         </w:rPr>
-        <w:t>Attendance_Percent – Student's attendance percentage.</w:t>
+        <w:t>Attendance_Percent</w:t>
+      </w:r>
+      <w:proofErr w:type="spellEnd"/>
+      <w:r>
+        <w:rPr>
+          <w:sz w:val="24"/>
+          <w:szCs w:val="24"/>
+          <w:lang w:val="en-IN"/>
+        </w:rPr>
+        <w:t xml:space="preserve"> – Student's attendance percentage.</w:t>
       </w:r>
     </w:p>
     <w:p>
@@ -563,7 +624,25 @@
           <w:szCs w:val="24"/>
           <w:lang w:val="en-IN"/>
         </w:rPr>
-        <w:t>The system uses these columns to perform calculations and analyze academic performance. The dataset should be described as sample data if it was created for demonstration purposes.</w:t>
+        <w:t xml:space="preserve">The system uses these columns to perform calculations and </w:t>
+      </w:r>
+      <w:proofErr w:type="spellStart"/>
+      <w:r>
+        <w:rPr>
+          <w:sz w:val="24"/>
+          <w:szCs w:val="24"/>
+          <w:lang w:val="en-IN"/>
+        </w:rPr>
+        <w:t>analyze</w:t>
+      </w:r>
+      <w:proofErr w:type="spellEnd"/>
+      <w:r>
+        <w:rPr>
+          <w:sz w:val="24"/>
+          <w:szCs w:val="24"/>
+          <w:lang w:val="en-IN"/>
+        </w:rPr>
+        <w:t xml:space="preserve"> academic performance. The dataset should be described as sample data if it was created for demonstration purposes.</w:t>
       </w:r>
     </w:p>
     <w:p>
@@ -668,7 +747,25 @@
           <w:szCs w:val="24"/>
           <w:lang w:val="en-IN"/>
         </w:rPr>
-        <w:t>The CSV file is loaded using Pandas into a DataFrame. The program checks the availability of the dataset and the required columns before processing the information.</w:t>
+        <w:t xml:space="preserve">The CSV file is loaded using Pandas into a </w:t>
+      </w:r>
+      <w:proofErr w:type="spellStart"/>
+      <w:r>
+        <w:rPr>
+          <w:sz w:val="24"/>
+          <w:szCs w:val="24"/>
+          <w:lang w:val="en-IN"/>
+        </w:rPr>
+        <w:t>DataFrame</w:t>
+      </w:r>
+      <w:proofErr w:type="spellEnd"/>
+      <w:r>
+        <w:rPr>
+          <w:sz w:val="24"/>
+          <w:szCs w:val="24"/>
+          <w:lang w:val="en-IN"/>
+        </w:rPr>
+        <w:t>. The program checks the availability of the dataset and the required columns before processing the information.</w:t>
       </w:r>
     </w:p>
     <w:p>
@@ -776,7 +873,43 @@
           <w:szCs w:val="24"/>
           <w:lang w:val="en-IN"/>
         </w:rPr>
-        <w:t>Pandas DataFrame operations are used to access, organize, inspect, and analyze student records. The data can be filtered, sorted, and summarized to understand student performance.</w:t>
+        <w:t xml:space="preserve">Pandas </w:t>
+      </w:r>
+      <w:proofErr w:type="spellStart"/>
+      <w:r>
+        <w:rPr>
+          <w:sz w:val="24"/>
+          <w:szCs w:val="24"/>
+          <w:lang w:val="en-IN"/>
+        </w:rPr>
+        <w:t>DataFrame</w:t>
+      </w:r>
+      <w:proofErr w:type="spellEnd"/>
+      <w:r>
+        <w:rPr>
+          <w:sz w:val="24"/>
+          <w:szCs w:val="24"/>
+          <w:lang w:val="en-IN"/>
+        </w:rPr>
+        <w:t xml:space="preserve"> operations are used to access, organize, inspect, and </w:t>
+      </w:r>
+      <w:proofErr w:type="spellStart"/>
+      <w:r>
+        <w:rPr>
+          <w:sz w:val="24"/>
+          <w:szCs w:val="24"/>
+          <w:lang w:val="en-IN"/>
+        </w:rPr>
+        <w:t>analyze</w:t>
+      </w:r>
+      <w:proofErr w:type="spellEnd"/>
+      <w:r>
+        <w:rPr>
+          <w:sz w:val="24"/>
+          <w:szCs w:val="24"/>
+          <w:lang w:val="en-IN"/>
+        </w:rPr>
+        <w:t xml:space="preserve"> student records. The data can be filtered, sorted, and summarized to understand student performance.</w:t>
       </w:r>
     </w:p>
     <w:p>
@@ -874,7 +1007,25 @@
           <w:szCs w:val="24"/>
           <w:lang w:val="en-IN"/>
         </w:rPr>
-        <w:t>Organizes student records using Pandas DataFrames.</w:t>
+        <w:t xml:space="preserve">Organizes student records using Pandas </w:t>
+      </w:r>
+      <w:proofErr w:type="spellStart"/>
+      <w:r>
+        <w:rPr>
+          <w:sz w:val="24"/>
+          <w:szCs w:val="24"/>
+          <w:lang w:val="en-IN"/>
+        </w:rPr>
+        <w:t>DataFrames</w:t>
+      </w:r>
+      <w:proofErr w:type="spellEnd"/>
+      <w:r>
+        <w:rPr>
+          <w:sz w:val="24"/>
+          <w:szCs w:val="24"/>
+          <w:lang w:val="en-IN"/>
+        </w:rPr>
+        <w:t>.</w:t>
       </w:r>
     </w:p>
     <w:p>
@@ -918,7 +1069,25 @@
           <w:szCs w:val="24"/>
           <w:lang w:val="en-IN"/>
         </w:rPr>
-        <w:t>Processes and analyzes academic data.</w:t>
+        <w:t xml:space="preserve">Processes and </w:t>
+      </w:r>
+      <w:proofErr w:type="spellStart"/>
+      <w:r>
+        <w:rPr>
+          <w:sz w:val="24"/>
+          <w:szCs w:val="24"/>
+          <w:lang w:val="en-IN"/>
+        </w:rPr>
+        <w:t>analyzes</w:t>
+      </w:r>
+      <w:proofErr w:type="spellEnd"/>
+      <w:r>
+        <w:rPr>
+          <w:sz w:val="24"/>
+          <w:szCs w:val="24"/>
+          <w:lang w:val="en-IN"/>
+        </w:rPr>
+        <w:t xml:space="preserve"> academic data.</w:t>
       </w:r>
     </w:p>
     <w:p>
@@ -1042,7 +1211,25 @@
           <w:szCs w:val="24"/>
           <w:lang w:val="en-IN"/>
         </w:rPr>
-        <w:t>The project successfully demonstrates the use of Python, NumPy, and Pandas to process and analyze student data. It provides a structured approach to handling student records and makes the displayed information easier to read and understand.</w:t>
+        <w:t xml:space="preserve">The project successfully demonstrates the use of Python, NumPy, and Pandas to process and </w:t>
+      </w:r>
+      <w:proofErr w:type="spellStart"/>
+      <w:r>
+        <w:rPr>
+          <w:sz w:val="24"/>
+          <w:szCs w:val="24"/>
+          <w:lang w:val="en-IN"/>
+        </w:rPr>
+        <w:t>analyze</w:t>
+      </w:r>
+      <w:proofErr w:type="spellEnd"/>
+      <w:r>
+        <w:rPr>
+          <w:sz w:val="24"/>
+          <w:szCs w:val="24"/>
+          <w:lang w:val="en-IN"/>
+        </w:rPr>
+        <w:t xml:space="preserve"> student data. It provides a structured approach to handling student records and makes the displayed information easier to read and understand.</w:t>
       </w:r>
     </w:p>
     <w:p>
@@ -1230,7 +1417,25 @@
           <w:szCs w:val="24"/>
           <w:lang w:val="en-IN"/>
         </w:rPr>
-        <w:t>I gained practical experience in identifying and correcting dataset-viewing issues, understanding how Pandas DataFrames display tabular information, and improving the readability and organization of program output. I also learned that correct data processing is not enough; the results must be presented clearly for users to understand them.</w:t>
+        <w:t xml:space="preserve">I gained practical experience in identifying and correcting dataset-viewing issues, understanding how Pandas </w:t>
+      </w:r>
+      <w:proofErr w:type="spellStart"/>
+      <w:r>
+        <w:rPr>
+          <w:sz w:val="24"/>
+          <w:szCs w:val="24"/>
+          <w:lang w:val="en-IN"/>
+        </w:rPr>
+        <w:t>DataFrames</w:t>
+      </w:r>
+      <w:proofErr w:type="spellEnd"/>
+      <w:r>
+        <w:rPr>
+          <w:sz w:val="24"/>
+          <w:szCs w:val="24"/>
+          <w:lang w:val="en-IN"/>
+        </w:rPr>
+        <w:t xml:space="preserve"> display tabular information, and improving the readability and organization of program output. I also learned that correct data processing is not enough; the results must be presented clearly for users to understand them.</w:t>
       </w:r>
     </w:p>
     <w:p>
@@ -1283,6 +1488,14 @@
           <w:lang w:val="en-IN"/>
         </w:rPr>
         <w:t xml:space="preserve"> </w:t>
+      </w:r>
+      <w:r>
+        <w:rPr>
+          <w:sz w:val="24"/>
+          <w:szCs w:val="24"/>
+          <w:lang w:val="en-IN"/>
+        </w:rPr>
+        <w:t>https://github.com/medha-su/student_performance_analytics_project.git</w:t>
       </w:r>
     </w:p>
     <w:p>
@@ -3610,6 +3823,7 @@
   <w:style w:type="character" w:default="1" w:styleId="DefaultParagraphFont">
     <w:name w:val="Default Paragraph Font"/>
     <w:uiPriority w:val="1"/>
+    <w:semiHidden/>
     <w:unhideWhenUsed/>
   </w:style>
   <w:style w:type="table" w:default="1" w:styleId="TableNormal">

</xml_diff>